<commit_message>
Patch title page: ASHBORN -> MARROWFROST (Ashborn Trilogy -> Marrowfrost Trilogy).
The .docx filename was rebranded earlier but the title-page text inside
still read the old working title; this swap copies in the freshly-patched
Desktop build so the share link serves the correctly-titled book.

Co-Authored-By: Claude Opus 4.7 (1M context) <noreply@anthropic.com>
</commit_message>
<xml_diff>
--- a/Marrowfrost-Book-1.docx
+++ b/Marrowfrost-Book-1.docx
@@ -42,7 +42,7 @@
           <w:sz w:val="56"/>
           <w:szCs w:val="56"/>
         </w:rPr>
-        <w:t xml:space="preserve">ASHBORN</w:t>
+        <w:t xml:space="preserve">MARROWFROST</w:t>
       </w:r>
     </w:p>
     <w:p>
@@ -60,7 +60,7 @@
           <w:sz w:val="32"/>
           <w:szCs w:val="32"/>
         </w:rPr>
-        <w:t xml:space="preserve">Book One of The Ashborn Trilogy</w:t>
+        <w:t xml:space="preserve">Book One of The Marrowfrost Trilogy</w:t>
       </w:r>
     </w:p>
     <w:p>
@@ -224,7 +224,7 @@
           <w:sz w:val="24"/>
           <w:szCs w:val="24"/>
         </w:rPr>
-        <w:t xml:space="preserve">ASHBORN</w:t>
+        <w:t xml:space="preserve">MARROWFROST</w:t>
       </w:r>
     </w:p>
     <w:p>
@@ -242,7 +242,7 @@
           <w:sz w:val="24"/>
           <w:szCs w:val="24"/>
         </w:rPr>
-        <w:t xml:space="preserve">Book One of The Ashborn Trilogy</w:t>
+        <w:t xml:space="preserve">Book One of The Marrowfrost Trilogy</w:t>
       </w:r>
     </w:p>
     <w:p>

</xml_diff>